<commit_message>
Restructure journey into 5 Realms; rename points meter to Merit; realm badges + nav
- Terminology: five stages are "Realms" (Realm 1: The Shoreline … Realm 5: The
  Evergreens); points meter "Level" → "Merit" across journey + badges + modal
- Badges: new "The Realms" family (Made it to Shore, Through the Thicket, In Full
  Bloom, Across the Fields, ROOTED to Thrive) + Reached Freedom as the all-realms
  capstone (auto-awards when all five realm badges earned); "Every Path Walked"
  completionist; reworded Framework Masteries to per-course; 6 new SVG icons
  (wave/thicket/bloom/wheat/evergreen/footprints)
- Journey: second sticky-toolbar row for realm navigation (settings-driven,
  lockable, current-realm highlight)
- Engine: dropped the 100-course Reached Freedom placeholder
- Docs: reference updated (Realms, Merit, badge families) + regenerated .docx;
  captured the full course/lesson plan as docs/P2P_Level_Map.xlsx

Co-Authored-By: Claude Opus 4.8 <noreply@anthropic.com>
</commit_message>
<xml_diff>
--- a/docs/word-exports/Purpose 2 Profit - Learning Journey System Reference.docx
+++ b/docs/word-exports/Purpose 2 Profit - Learning Journey System Reference.docx
@@ -174,6 +174,551 @@
       </w:r>
       <w:r>
         <w:t xml:space="preserve">); the design is built to lift into a customer account backend before public launch (see §9).</w:t>
+      </w:r>
+    </w:p>
+    <w:p>
+      <w:pPr>
+        <w:pStyle w:val="Heading2"/>
+      </w:pPr>
+      <w:r>
+        <w:t xml:space="preserve">1a. The five Realms (multi-board structure)</w:t>
+      </w:r>
+    </w:p>
+    <w:p>
+      <w:pPr>
+        <w:pStyle w:val="Normal"/>
+      </w:pPr>
+      <w:r>
+        <w:t xml:space="preserve">The journey is split into </w:t>
+      </w:r>
+      <w:r>
+        <w:rPr>
+          <w:b/>
+        </w:rPr>
+        <w:t xml:space="preserve">five Realms</w:t>
+      </w:r>
+      <w:r>
+        <w:t xml:space="preserve">, each its own board + journey page (the multi-board architecture — one board caps ~8000–11k px). The full course/lesson plan lives in </w:t>
+      </w:r>
+      <w:r>
+        <w:rPr>
+          <w:b/>
+        </w:rPr>
+        <w:t xml:space="preserve">`docs/P2P_Level_Map.xlsx`</w:t>
+      </w:r>
+      <w:r>
+        <w:t xml:space="preserve"> (two tabs: Level Legend, Course Map — every level, course, lesson order, and which course awards which badge). Realms (a Realm = a stage; </w:t>
+      </w:r>
+      <w:r>
+        <w:rPr>
+          <w:b/>
+        </w:rPr>
+        <w:t xml:space="preserve">do not</w:t>
+      </w:r>
+      <w:r>
+        <w:t xml:space="preserve"> call them "Levels" — that word is now the points meter, renamed </w:t>
+      </w:r>
+      <w:r>
+        <w:rPr>
+          <w:b/>
+        </w:rPr>
+        <w:t xml:space="preserve">Merit</w:t>
+      </w:r>
+      <w:r>
+        <w:t xml:space="preserve">):</w:t>
+      </w:r>
+    </w:p>
+    <w:tbl>
+      <w:tblPr>
+        <w:tblW w:w="9360" w:type="dxa"/>
+        <w:tblLayout w:type="fixed"/>
+        <w:tblBorders>
+          <w:top w:val="single" w:sz="4" w:color="B7B3AB"/>
+          <w:left w:val="single" w:sz="4" w:color="B7B3AB"/>
+          <w:bottom w:val="single" w:sz="4" w:color="B7B3AB"/>
+          <w:right w:val="single" w:sz="4" w:color="B7B3AB"/>
+          <w:insideH w:val="single" w:sz="4" w:color="B7B3AB"/>
+          <w:insideV w:val="single" w:sz="4" w:color="B7B3AB"/>
+        </w:tblBorders>
+      </w:tblPr>
+      <w:tblGrid>
+        <w:gridCol w:w="2340"/>
+        <w:gridCol w:w="2340"/>
+        <w:gridCol w:w="2340"/>
+        <w:gridCol w:w="2340"/>
+      </w:tblGrid>
+      <w:tr>
+        <w:tc>
+          <w:tcPr>
+            <w:tcW w:w="2340" w:type="dxa"/>
+            <w:shd w:val="clear" w:color="auto" w:fill="1E8E5A"/>
+          </w:tcPr>
+          <w:p>
+            <w:pPr>
+              <w:pStyle w:val="TblCell"/>
+            </w:pPr>
+            <w:r>
+              <w:rPr>
+                <w:b/>
+                <w:color w:val="FFFFFF"/>
+              </w:rPr>
+              <w:t xml:space="preserve">#</w:t>
+            </w:r>
+          </w:p>
+        </w:tc>
+        <w:tc>
+          <w:tcPr>
+            <w:tcW w:w="2340" w:type="dxa"/>
+            <w:shd w:val="clear" w:color="auto" w:fill="1E8E5A"/>
+          </w:tcPr>
+          <w:p>
+            <w:pPr>
+              <w:pStyle w:val="TblCell"/>
+            </w:pPr>
+            <w:r>
+              <w:rPr>
+                <w:b/>
+                <w:color w:val="FFFFFF"/>
+              </w:rPr>
+              <w:t xml:space="preserve">Realm</w:t>
+            </w:r>
+          </w:p>
+        </w:tc>
+        <w:tc>
+          <w:tcPr>
+            <w:tcW w:w="2340" w:type="dxa"/>
+            <w:shd w:val="clear" w:color="auto" w:fill="1E8E5A"/>
+          </w:tcPr>
+          <w:p>
+            <w:pPr>
+              <w:pStyle w:val="TblCell"/>
+            </w:pPr>
+            <w:r>
+              <w:rPr>
+                <w:b/>
+                <w:color w:val="FFFFFF"/>
+              </w:rPr>
+              <w:t xml:space="preserve">Terrain</w:t>
+            </w:r>
+          </w:p>
+        </w:tc>
+        <w:tc>
+          <w:tcPr>
+            <w:tcW w:w="2340" w:type="dxa"/>
+            <w:shd w:val="clear" w:color="auto" w:fill="1E8E5A"/>
+          </w:tcPr>
+          <w:p>
+            <w:pPr>
+              <w:pStyle w:val="TblCell"/>
+            </w:pPr>
+            <w:r>
+              <w:rPr>
+                <w:b/>
+                <w:color w:val="FFFFFF"/>
+              </w:rPr>
+              <w:t xml:space="preserve">Anchor / gate</w:t>
+            </w:r>
+          </w:p>
+        </w:tc>
+      </w:tr>
+      <w:tr>
+        <w:tc>
+          <w:tcPr>
+            <w:tcW w:w="2340" w:type="dxa"/>
+          </w:tcPr>
+          <w:p>
+            <w:pPr>
+              <w:pStyle w:val="TblCell"/>
+            </w:pPr>
+            <w:r>
+              <w:t xml:space="preserve">1</w:t>
+            </w:r>
+          </w:p>
+        </w:tc>
+        <w:tc>
+          <w:tcPr>
+            <w:tcW w:w="2340" w:type="dxa"/>
+          </w:tcPr>
+          <w:p>
+            <w:pPr>
+              <w:pStyle w:val="TblCell"/>
+            </w:pPr>
+            <w:r>
+              <w:t xml:space="preserve">The Shoreline</w:t>
+            </w:r>
+          </w:p>
+        </w:tc>
+        <w:tc>
+          <w:tcPr>
+            <w:tcW w:w="2340" w:type="dxa"/>
+          </w:tcPr>
+          <w:p>
+            <w:pPr>
+              <w:pStyle w:val="TblCell"/>
+            </w:pPr>
+            <w:r>
+              <w:t xml:space="preserve">Ocean → Shore</w:t>
+            </w:r>
+          </w:p>
+        </w:tc>
+        <w:tc>
+          <w:tcPr>
+            <w:tcW w:w="2340" w:type="dxa"/>
+          </w:tcPr>
+          <w:p>
+            <w:pPr>
+              <w:pStyle w:val="TblCell"/>
+            </w:pPr>
+            <w:r>
+              <w:rPr>
+                <w:b/>
+              </w:rPr>
+              <w:t xml:space="preserve">GROWS</w:t>
+            </w:r>
+            <w:r>
+              <w:t xml:space="preserve"> must be completed first (gates the rest of Realm 1)</w:t>
+            </w:r>
+          </w:p>
+        </w:tc>
+      </w:tr>
+      <w:tr>
+        <w:tc>
+          <w:tcPr>
+            <w:tcW w:w="2340" w:type="dxa"/>
+            <w:shd w:val="clear" w:color="auto" w:fill="F4F2EC"/>
+          </w:tcPr>
+          <w:p>
+            <w:pPr>
+              <w:pStyle w:val="TblCell"/>
+            </w:pPr>
+            <w:r>
+              <w:t xml:space="preserve">2</w:t>
+            </w:r>
+          </w:p>
+        </w:tc>
+        <w:tc>
+          <w:tcPr>
+            <w:tcW w:w="2340" w:type="dxa"/>
+            <w:shd w:val="clear" w:color="auto" w:fill="F4F2EC"/>
+          </w:tcPr>
+          <w:p>
+            <w:pPr>
+              <w:pStyle w:val="TblCell"/>
+            </w:pPr>
+            <w:r>
+              <w:t xml:space="preserve">The Thicket</w:t>
+            </w:r>
+          </w:p>
+        </w:tc>
+        <w:tc>
+          <w:tcPr>
+            <w:tcW w:w="2340" w:type="dxa"/>
+            <w:shd w:val="clear" w:color="auto" w:fill="F4F2EC"/>
+          </w:tcPr>
+          <w:p>
+            <w:pPr>
+              <w:pStyle w:val="TblCell"/>
+            </w:pPr>
+            <w:r>
+              <w:t xml:space="preserve">Mystical Forest</w:t>
+            </w:r>
+          </w:p>
+        </w:tc>
+        <w:tc>
+          <w:tcPr>
+            <w:tcW w:w="2340" w:type="dxa"/>
+            <w:shd w:val="clear" w:color="auto" w:fill="F4F2EC"/>
+          </w:tcPr>
+          <w:p>
+            <w:pPr>
+              <w:pStyle w:val="TblCell"/>
+            </w:pPr>
+            <w:r>
+              <w:t xml:space="preserve">none — fully open</w:t>
+            </w:r>
+          </w:p>
+        </w:tc>
+      </w:tr>
+      <w:tr>
+        <w:tc>
+          <w:tcPr>
+            <w:tcW w:w="2340" w:type="dxa"/>
+          </w:tcPr>
+          <w:p>
+            <w:pPr>
+              <w:pStyle w:val="TblCell"/>
+            </w:pPr>
+            <w:r>
+              <w:t xml:space="preserve">3</w:t>
+            </w:r>
+          </w:p>
+        </w:tc>
+        <w:tc>
+          <w:tcPr>
+            <w:tcW w:w="2340" w:type="dxa"/>
+          </w:tcPr>
+          <w:p>
+            <w:pPr>
+              <w:pStyle w:val="TblCell"/>
+            </w:pPr>
+            <w:r>
+              <w:t xml:space="preserve">The Bloom</w:t>
+            </w:r>
+          </w:p>
+        </w:tc>
+        <w:tc>
+          <w:tcPr>
+            <w:tcW w:w="2340" w:type="dxa"/>
+          </w:tcPr>
+          <w:p>
+            <w:pPr>
+              <w:pStyle w:val="TblCell"/>
+            </w:pPr>
+            <w:r>
+              <w:t xml:space="preserve">Thriving Desert</w:t>
+            </w:r>
+          </w:p>
+        </w:tc>
+        <w:tc>
+          <w:tcPr>
+            <w:tcW w:w="2340" w:type="dxa"/>
+          </w:tcPr>
+          <w:p>
+            <w:pPr>
+              <w:pStyle w:val="TblCell"/>
+            </w:pPr>
+            <w:r>
+              <w:t xml:space="preserve">none — fully open</w:t>
+            </w:r>
+          </w:p>
+        </w:tc>
+      </w:tr>
+      <w:tr>
+        <w:tc>
+          <w:tcPr>
+            <w:tcW w:w="2340" w:type="dxa"/>
+            <w:shd w:val="clear" w:color="auto" w:fill="F4F2EC"/>
+          </w:tcPr>
+          <w:p>
+            <w:pPr>
+              <w:pStyle w:val="TblCell"/>
+            </w:pPr>
+            <w:r>
+              <w:t xml:space="preserve">4</w:t>
+            </w:r>
+          </w:p>
+        </w:tc>
+        <w:tc>
+          <w:tcPr>
+            <w:tcW w:w="2340" w:type="dxa"/>
+            <w:shd w:val="clear" w:color="auto" w:fill="F4F2EC"/>
+          </w:tcPr>
+          <w:p>
+            <w:pPr>
+              <w:pStyle w:val="TblCell"/>
+            </w:pPr>
+            <w:r>
+              <w:t xml:space="preserve">The Fields</w:t>
+            </w:r>
+          </w:p>
+        </w:tc>
+        <w:tc>
+          <w:tcPr>
+            <w:tcW w:w="2340" w:type="dxa"/>
+            <w:shd w:val="clear" w:color="auto" w:fill="F4F2EC"/>
+          </w:tcPr>
+          <w:p>
+            <w:pPr>
+              <w:pStyle w:val="TblCell"/>
+            </w:pPr>
+            <w:r>
+              <w:t xml:space="preserve">Grasslands</w:t>
+            </w:r>
+          </w:p>
+        </w:tc>
+        <w:tc>
+          <w:tcPr>
+            <w:tcW w:w="2340" w:type="dxa"/>
+            <w:shd w:val="clear" w:color="auto" w:fill="F4F2EC"/>
+          </w:tcPr>
+          <w:p>
+            <w:pPr>
+              <w:pStyle w:val="TblCell"/>
+            </w:pPr>
+            <w:r>
+              <w:t xml:space="preserve">none — fully open</w:t>
+            </w:r>
+          </w:p>
+        </w:tc>
+      </w:tr>
+      <w:tr>
+        <w:tc>
+          <w:tcPr>
+            <w:tcW w:w="2340" w:type="dxa"/>
+          </w:tcPr>
+          <w:p>
+            <w:pPr>
+              <w:pStyle w:val="TblCell"/>
+            </w:pPr>
+            <w:r>
+              <w:t xml:space="preserve">5</w:t>
+            </w:r>
+          </w:p>
+        </w:tc>
+        <w:tc>
+          <w:tcPr>
+            <w:tcW w:w="2340" w:type="dxa"/>
+          </w:tcPr>
+          <w:p>
+            <w:pPr>
+              <w:pStyle w:val="TblCell"/>
+            </w:pPr>
+            <w:r>
+              <w:t xml:space="preserve">The Evergreens</w:t>
+            </w:r>
+          </w:p>
+        </w:tc>
+        <w:tc>
+          <w:tcPr>
+            <w:tcW w:w="2340" w:type="dxa"/>
+          </w:tcPr>
+          <w:p>
+            <w:pPr>
+              <w:pStyle w:val="TblCell"/>
+            </w:pPr>
+            <w:r>
+              <w:t xml:space="preserve">Mature Woods</w:t>
+            </w:r>
+          </w:p>
+        </w:tc>
+        <w:tc>
+          <w:tcPr>
+            <w:tcW w:w="2340" w:type="dxa"/>
+          </w:tcPr>
+          <w:p>
+            <w:pPr>
+              <w:pStyle w:val="TblCell"/>
+            </w:pPr>
+            <w:r>
+              <w:rPr>
+                <w:b/>
+              </w:rPr>
+              <w:t xml:space="preserve">ROOTED</w:t>
+            </w:r>
+            <w:r>
+              <w:t xml:space="preserve"> must be completed first (gates the rest)</w:t>
+            </w:r>
+          </w:p>
+        </w:tc>
+      </w:tr>
+    </w:tbl>
+    <w:p>
+      <w:pPr/>
+    </w:p>
+    <w:p>
+      <w:pPr>
+        <w:pStyle w:val="Quote"/>
+      </w:pPr>
+      <w:r>
+        <w:t xml:space="preserve">Note: the xlsx still labels Realm 5 "The Canopy" — the owner renamed it to</w:t>
+      </w:r>
+    </w:p>
+    <w:p>
+      <w:pPr>
+        <w:pStyle w:val="Quote"/>
+      </w:pPr>
+      <w:r>
+        <w:rPr>
+          <w:b/>
+        </w:rPr>
+        <w:t xml:space="preserve">The Evergreens</w:t>
+      </w:r>
+      <w:r>
+        <w:t xml:space="preserve"> (evergreen business); reconcile the sheet when convenient.</w:t>
+      </w:r>
+    </w:p>
+    <w:p>
+      <w:pPr>
+        <w:pStyle w:val="Normal"/>
+      </w:pPr>
+      <w:r>
+        <w:rPr>
+          <w:b/>
+        </w:rPr>
+        <w:t xml:space="preserve">Lock rules:</w:t>
+      </w:r>
+      <w:r>
+        <w:t xml:space="preserve"> only </w:t>
+      </w:r>
+      <w:r>
+        <w:rPr>
+          <w:i/>
+        </w:rPr>
+        <w:t xml:space="preserve">Your Journey Begins Here</w:t>
+      </w:r>
+      <w:r>
+        <w:t xml:space="preserve"> and </w:t>
+      </w:r>
+      <w:r>
+        <w:rPr>
+          <w:i/>
+        </w:rPr>
+        <w:t xml:space="preserve">Welcome Aboard (incl. RAFT)</w:t>
+      </w:r>
+      <w:r>
+        <w:t xml:space="preserve"> are always-locked-first. After that every Realm is open in any order, EXCEPT a Realm with an anchor course (GROWS in 1, ROOTED in 5) keeps the rest of that Realm locked until the anchor is done. Courses are </w:t>
+      </w:r>
+      <w:r>
+        <w:rPr>
+          <w:b/>
+        </w:rPr>
+        <w:t xml:space="preserve">Main / Offshoot / Check</w:t>
+      </w:r>
+      <w:r>
+        <w:t xml:space="preserve">; offshoots are optional and hang off a trunk course.</w:t>
+      </w:r>
+    </w:p>
+    <w:p>
+      <w:pPr>
+        <w:pStyle w:val="Normal"/>
+      </w:pPr>
+      <w:r>
+        <w:rPr>
+          <w:b/>
+        </w:rPr>
+        <w:t xml:space="preserve">Navigation:</w:t>
+      </w:r>
+      <w:r>
+        <w:t xml:space="preserve"> the sticky toolbar has a </w:t>
+      </w:r>
+      <w:r>
+        <w:rPr>
+          <w:b/>
+        </w:rPr>
+        <w:t xml:space="preserve">second row</w:t>
+      </w:r>
+      <w:r>
+        <w:t xml:space="preserve"> of Realm buttons (settings </w:t>
+      </w:r>
+      <w:r>
+        <w:rPr>
+          <w:rFonts w:ascii="Consolas" w:hAnsi="Consolas"/>
+          <w:sz w:val="19"/>
+        </w:rPr>
+        <w:t xml:space="preserve">realm_1..5_name/url/locked</w:t>
+      </w:r>
+      <w:r>
+        <w:t xml:space="preserve">, </w:t>
+      </w:r>
+      <w:r>
+        <w:rPr>
+          <w:rFonts w:ascii="Consolas" w:hAnsi="Consolas"/>
+          <w:sz w:val="19"/>
+        </w:rPr>
+        <w:t xml:space="preserve">current_realm</w:t>
+      </w:r>
+      <w:r>
+        <w:t xml:space="preserve">) for jumping between boards; each board's bottom also links to the next. Realm 5 defaults locked.</w:t>
       </w:r>
     </w:p>
     <w:p>
@@ -3800,7 +4345,7 @@
               <w:rPr>
                 <w:b/>
               </w:rPr>
-              <w:t xml:space="preserve">Level up every</w:t>
+              <w:t xml:space="preserve">Earn a Merit every</w:t>
             </w:r>
           </w:p>
         </w:tc>
@@ -3824,6 +4369,43 @@
     </w:tbl>
     <w:p>
       <w:pPr/>
+    </w:p>
+    <w:p>
+      <w:pPr>
+        <w:pStyle w:val="Normal"/>
+      </w:pPr>
+      <w:r>
+        <w:t xml:space="preserve">The points meter (</w:t>
+      </w:r>
+      <w:r>
+        <w:rPr>
+          <w:rFonts w:ascii="Consolas" w:hAnsi="Consolas"/>
+          <w:sz w:val="19"/>
+        </w:rPr>
+        <w:t xml:space="preserve">points ÷ 250</w:t>
+      </w:r>
+      <w:r>
+        <w:t xml:space="preserve">) is labeled </w:t>
+      </w:r>
+      <w:r>
+        <w:rPr>
+          <w:b/>
+        </w:rPr>
+        <w:t xml:space="preserve">Merit</w:t>
+      </w:r>
+      <w:r>
+        <w:t xml:space="preserve"> in the UI (renamed from "Level," which now belongs to the Realms). The engine function is still </w:t>
+      </w:r>
+      <w:r>
+        <w:rPr>
+          <w:rFonts w:ascii="Consolas" w:hAnsi="Consolas"/>
+          <w:sz w:val="19"/>
+        </w:rPr>
+        <w:t xml:space="preserve">P2P.level()</w:t>
+      </w:r>
+      <w:r>
+        <w:t xml:space="preserve">; only the display label changed.</w:t>
+      </w:r>
     </w:p>
     <w:p>
       <w:pPr>
@@ -3852,7 +4434,7 @@
         <w:pStyle w:val="Heading2"/>
       </w:pPr>
       <w:r>
-        <w:t xml:space="preserve">9. Badges roster (36 total)</w:t>
+        <w:t xml:space="preserve">9. Badges roster (42 total)</w:t>
       </w:r>
     </w:p>
     <w:p>
@@ -3902,7 +4484,39 @@
         <w:t xml:space="preserve">Journey Milestones</w:t>
       </w:r>
       <w:r>
-        <w:t xml:space="preserve"> — Set Sail (manual/default) · First Steps (auto, 1 course) · First Win (manual — pending Quick Wins course) · Finding Your Current (auto, 3 courses) · Reached Freedom (auto, 100 courses — placeholder total).</w:t>
+        <w:t xml:space="preserve"> — Set Sail (auto, on reaching the journey) · First Steps (auto, 1 course) · First Win (manual — pending Quick Wins course) · Finding Your Current (auto, 3 courses).</w:t>
+      </w:r>
+    </w:p>
+    <w:p>
+      <w:pPr>
+        <w:pStyle w:val="Normal"/>
+      </w:pPr>
+      <w:r>
+        <w:rPr>
+          <w:b/>
+        </w:rPr>
+        <w:t xml:space="preserve">The Realms</w:t>
+      </w:r>
+      <w:r>
+        <w:t xml:space="preserve"> — Made it to Shore (wave) · Through the Thicket (thicket) · In Full Bloom (bloom) · Across the Fields (wheat) · ROOTED to Thrive (evergreen) — one per Realm, manual until each Realm's required-course set is mapped — plus </w:t>
+      </w:r>
+      <w:r>
+        <w:rPr>
+          <w:b/>
+        </w:rPr>
+        <w:t xml:space="preserve">Reached Freedom</w:t>
+      </w:r>
+      <w:r>
+        <w:t xml:space="preserve"> (star cluster) the </w:t>
+      </w:r>
+      <w:r>
+        <w:rPr>
+          <w:b/>
+        </w:rPr>
+        <w:t xml:space="preserve">capstone</w:t>
+      </w:r>
+      <w:r>
+        <w:t xml:space="preserve">, auto-awarded on the badges page once all five Realm badges are earned. These read together as the progress journey.</w:t>
       </w:r>
     </w:p>
     <w:p>
@@ -3916,7 +4530,7 @@
         <w:t xml:space="preserve">Framework Masteries</w:t>
       </w:r>
       <w:r>
-        <w:t xml:space="preserve"> — RAFT / GROWS / ROOTED Master (manual — pending leg mapping).</w:t>
+        <w:t xml:space="preserve"> — RAFT / GROWS / ROOTED Master (manual — award on completing that framework's course; see the xlsx badge column).</w:t>
       </w:r>
     </w:p>
     <w:p>
@@ -4000,15 +4614,15 @@
         <w:t xml:space="preserve">Special</w:t>
       </w:r>
       <w:r>
-        <w:t xml:space="preserve"> — Founder (manual, Founder's Pass) · Masterclass (manual, live event).</w:t>
-      </w:r>
-    </w:p>
-    <w:p>
-      <w:pPr>
-        <w:pStyle w:val="Normal"/>
-      </w:pPr>
-      <w:r>
-        <w:t xml:space="preserve">The badges page shows a live "X of 36 earned" summary and a badge-unlock </w:t>
+        <w:t xml:space="preserve"> — Every Path Walked (footprints — manual, complete every course incl. optionals) · Founder (manual, Founder's Pass) · Masterclass (manual, live event).</w:t>
+      </w:r>
+    </w:p>
+    <w:p>
+      <w:pPr>
+        <w:pStyle w:val="Normal"/>
+      </w:pPr>
+      <w:r>
+        <w:t xml:space="preserve">The badges page shows a live "X of 42 earned" summary and a badge-unlock </w:t>
       </w:r>
       <w:r>
         <w:rPr>
@@ -4017,7 +4631,67 @@
         <w:t xml:space="preserve">popup</w:t>
       </w:r>
       <w:r>
-        <w:t xml:space="preserve"> (aurora confetti + stars + twinkles) the first time each newly-earned badge is seen in a browser.</w:t>
+        <w:t xml:space="preserve"> (aurora confetti + stars + twinkles) the first time each newly-earned badge is seen in a browser. Icons added for the Realms: </w:t>
+      </w:r>
+      <w:r>
+        <w:rPr>
+          <w:rFonts w:ascii="Consolas" w:hAnsi="Consolas"/>
+          <w:sz w:val="19"/>
+        </w:rPr>
+        <w:t xml:space="preserve">wave</w:t>
+      </w:r>
+      <w:r>
+        <w:t xml:space="preserve">, </w:t>
+      </w:r>
+      <w:r>
+        <w:rPr>
+          <w:rFonts w:ascii="Consolas" w:hAnsi="Consolas"/>
+          <w:sz w:val="19"/>
+        </w:rPr>
+        <w:t xml:space="preserve">thicket</w:t>
+      </w:r>
+      <w:r>
+        <w:t xml:space="preserve">, </w:t>
+      </w:r>
+      <w:r>
+        <w:rPr>
+          <w:rFonts w:ascii="Consolas" w:hAnsi="Consolas"/>
+          <w:sz w:val="19"/>
+        </w:rPr>
+        <w:t xml:space="preserve">bloom</w:t>
+      </w:r>
+      <w:r>
+        <w:t xml:space="preserve">, </w:t>
+      </w:r>
+      <w:r>
+        <w:rPr>
+          <w:rFonts w:ascii="Consolas" w:hAnsi="Consolas"/>
+          <w:sz w:val="19"/>
+        </w:rPr>
+        <w:t xml:space="preserve">wheat</w:t>
+      </w:r>
+      <w:r>
+        <w:t xml:space="preserve">, </w:t>
+      </w:r>
+      <w:r>
+        <w:rPr>
+          <w:rFonts w:ascii="Consolas" w:hAnsi="Consolas"/>
+          <w:sz w:val="19"/>
+        </w:rPr>
+        <w:t xml:space="preserve">evergreen</w:t>
+      </w:r>
+      <w:r>
+        <w:t xml:space="preserve">, </w:t>
+      </w:r>
+      <w:r>
+        <w:rPr>
+          <w:rFonts w:ascii="Consolas" w:hAnsi="Consolas"/>
+          <w:sz w:val="19"/>
+        </w:rPr>
+        <w:t xml:space="preserve">footprints</w:t>
+      </w:r>
+      <w:r>
+        <w:t xml:space="preserve">.</w:t>
       </w:r>
     </w:p>
     <w:p>
@@ -4509,6 +5183,87 @@
       </w:pPr>
       <w:r>
         <w:t xml:space="preserve">  vs. all-access paths; subscription later.</w:t>
+      </w:r>
+    </w:p>
+    <w:p>
+      <w:pPr>
+        <w:pStyle w:val="ListP"/>
+      </w:pPr>
+      <w:r>
+        <w:t xml:space="preserve">•  </w:t>
+      </w:r>
+      <w:r>
+        <w:rPr>
+          <w:b/>
+        </w:rPr>
+        <w:t xml:space="preserve">Multi-board / per-leg architecture (scaling the map):</w:t>
+      </w:r>
+      <w:r>
+        <w:t xml:space="preserve"> a single baked board</w:t>
+      </w:r>
+    </w:p>
+    <w:p>
+      <w:pPr>
+        <w:pStyle w:val="Normal"/>
+      </w:pPr>
+      <w:r>
+        <w:t xml:space="preserve">  caps at ~8000 px tall (the art tool's limit; Shopify's 20 MP cap is higher, so   the tool is the binding constraint) — roughly ~10 course stops per board. Do   </w:t>
+      </w:r>
+      <w:r>
+        <w:rPr>
+          <w:b/>
+        </w:rPr>
+        <w:t xml:space="preserve">not</w:t>
+      </w:r>
+      <w:r>
+        <w:t xml:space="preserve"> grow one endless image. When the catalog outgrows a board, split the   journey into </w:t>
+      </w:r>
+      <w:r>
+        <w:rPr>
+          <w:b/>
+        </w:rPr>
+        <w:t xml:space="preserve">legs/chapters</w:t>
+      </w:r>
+      <w:r>
+        <w:t xml:space="preserve">, each its own board image + journey-style page,   with a "path continues…" hand-off linking one to the next. The </w:t>
+      </w:r>
+      <w:r>
+        <w:rPr>
+          <w:b/>
+        </w:rPr>
+        <w:t xml:space="preserve">RAFT → GROWS →   ROOTED</w:t>
+      </w:r>
+      <w:r>
+        <w:t xml:space="preserve"> structure is the natural regional split (one board per leg). Because   points/badges/streaks all live in the shared engine (</w:t>
+      </w:r>
+      <w:r>
+        <w:rPr>
+          <w:rFonts w:ascii="Consolas" w:hAnsi="Consolas"/>
+          <w:sz w:val="19"/>
+        </w:rPr>
+        <w:t xml:space="preserve">window.P2P</w:t>
+      </w:r>
+      <w:r>
+        <w:t xml:space="preserve">), not in any   one board, the multi-board map stays a single connected journey — each new leg   is just another </w:t>
+      </w:r>
+      <w:r>
+        <w:rPr>
+          <w:rFonts w:ascii="Consolas" w:hAnsi="Consolas"/>
+          <w:sz w:val="19"/>
+        </w:rPr>
+        <w:t xml:space="preserve">p2p-learning-journey</w:t>
+      </w:r>
+      <w:r>
+        <w:t xml:space="preserve"> page pointing to the next. Treat the   current board as </w:t>
+      </w:r>
+      <w:r>
+        <w:rPr>
+          <w:b/>
+        </w:rPr>
+        <w:t xml:space="preserve">leg one</w:t>
+      </w:r>
+      <w:r>
+        <w:t xml:space="preserve">, not the whole map.</w:t>
       </w:r>
     </w:p>
     <w:sectPr>

</xml_diff>